<commit_message>
Added the final HTML form preview function
</commit_message>
<xml_diff>
--- a/outputs/reports/eCRF_Specification_AE.docx
+++ b/outputs/reports/eCRF_Specification_AE.docx
@@ -57,6 +57,72 @@
           </w:tcPr>
           <w:p>
             <w:r>
+              <w:t>Indication</w:t>
+            </w:r>
+          </w:p>
+        </w:tc>
+        <w:tc>
+          <w:tcPr>
+            <w:tcW w:type="dxa" w:w="4320"/>
+          </w:tcPr>
+          <w:p>
+            <w:r>
+              <w:t>Heart Attack, NSTEMI</w:t>
+            </w:r>
+          </w:p>
+        </w:tc>
+      </w:tr>
+      <w:tr>
+        <w:tc>
+          <w:tcPr>
+            <w:tcW w:type="dxa" w:w="4320"/>
+          </w:tcPr>
+          <w:p>
+            <w:r>
+              <w:t>Title</w:t>
+            </w:r>
+          </w:p>
+        </w:tc>
+        <w:tc>
+          <w:tcPr>
+            <w:tcW w:type="dxa" w:w="4320"/>
+          </w:tcPr>
+          <w:p>
+            <w:r>
+              <w:t>A Phase 2 Prospective, Randomized, Double-blind, Sham-controlled, Parallel-group, Multi-center Trial of AMI MultiStem® Therapy in Subjects With Non-ST Elevation Acute Myocardial Infarction</w:t>
+            </w:r>
+          </w:p>
+        </w:tc>
+      </w:tr>
+      <w:tr>
+        <w:tc>
+          <w:tcPr>
+            <w:tcW w:type="dxa" w:w="4320"/>
+          </w:tcPr>
+          <w:p>
+            <w:r>
+              <w:t>Phase</w:t>
+            </w:r>
+          </w:p>
+        </w:tc>
+        <w:tc>
+          <w:tcPr>
+            <w:tcW w:type="dxa" w:w="4320"/>
+          </w:tcPr>
+          <w:p>
+            <w:r>
+              <w:t>PHASE2</w:t>
+            </w:r>
+          </w:p>
+        </w:tc>
+      </w:tr>
+      <w:tr>
+        <w:tc>
+          <w:tcPr>
+            <w:tcW w:type="dxa" w:w="4320"/>
+          </w:tcPr>
+          <w:p>
+            <w:r>
               <w:t>Nct Id</w:t>
             </w:r>
           </w:p>
@@ -89,7 +155,161 @@
           </w:tcPr>
           <w:p>
             <w:r>
-              <w:t>A Phase 2 Prospective, Randomized, Double-blind, Sham-controlled, Parallel-group, Multi-center Trial of</w:t>
+              <w:t>A Phase 2 Prospective, Randomized, Double-blind, Sham-controlled, Parallel-group, Multi-center Trial of AMI MultiStem® Therapy in Subjects With Non-ST Elevation Acute Myocardial Infarction</w:t>
+            </w:r>
+          </w:p>
+        </w:tc>
+      </w:tr>
+      <w:tr>
+        <w:tc>
+          <w:tcPr>
+            <w:tcW w:type="dxa" w:w="4320"/>
+          </w:tcPr>
+          <w:p>
+            <w:r>
+              <w:t>Brief Summary</w:t>
+            </w:r>
+          </w:p>
+        </w:tc>
+        <w:tc>
+          <w:tcPr>
+            <w:tcW w:type="dxa" w:w="4320"/>
+          </w:tcPr>
+          <w:p>
+            <w:r>
+              <w:t>This is a double-blind, sham-controlled clinical study to evaluate the safety and feasibility of AMI MultiStem therapy in subjects who have had a heart attack (Non-ST elevation MI).</w:t>
+            </w:r>
+          </w:p>
+        </w:tc>
+      </w:tr>
+      <w:tr>
+        <w:tc>
+          <w:tcPr>
+            <w:tcW w:type="dxa" w:w="4320"/>
+          </w:tcPr>
+          <w:p>
+            <w:r>
+              <w:t>Study Type</w:t>
+            </w:r>
+          </w:p>
+        </w:tc>
+        <w:tc>
+          <w:tcPr>
+            <w:tcW w:type="dxa" w:w="4320"/>
+          </w:tcPr>
+          <w:p>
+            <w:r>
+              <w:t>INTERVENTIONAL</w:t>
+            </w:r>
+          </w:p>
+        </w:tc>
+      </w:tr>
+      <w:tr>
+        <w:tc>
+          <w:tcPr>
+            <w:tcW w:type="dxa" w:w="4320"/>
+          </w:tcPr>
+          <w:p>
+            <w:r>
+              <w:t>Enrollment Count</w:t>
+            </w:r>
+          </w:p>
+        </w:tc>
+        <w:tc>
+          <w:tcPr>
+            <w:tcW w:type="dxa" w:w="4320"/>
+          </w:tcPr>
+          <w:p>
+            <w:r>
+              <w:t>34</w:t>
+            </w:r>
+          </w:p>
+        </w:tc>
+      </w:tr>
+      <w:tr>
+        <w:tc>
+          <w:tcPr>
+            <w:tcW w:type="dxa" w:w="4320"/>
+          </w:tcPr>
+          <w:p>
+            <w:r>
+              <w:t>Allocation</w:t>
+            </w:r>
+          </w:p>
+        </w:tc>
+        <w:tc>
+          <w:tcPr>
+            <w:tcW w:type="dxa" w:w="4320"/>
+          </w:tcPr>
+          <w:p>
+            <w:r>
+              <w:t>RANDOMIZED</w:t>
+            </w:r>
+          </w:p>
+        </w:tc>
+      </w:tr>
+      <w:tr>
+        <w:tc>
+          <w:tcPr>
+            <w:tcW w:type="dxa" w:w="4320"/>
+          </w:tcPr>
+          <w:p>
+            <w:r>
+              <w:t>Intervention Model</w:t>
+            </w:r>
+          </w:p>
+        </w:tc>
+        <w:tc>
+          <w:tcPr>
+            <w:tcW w:type="dxa" w:w="4320"/>
+          </w:tcPr>
+          <w:p>
+            <w:r>
+              <w:t>PARALLEL</w:t>
+            </w:r>
+          </w:p>
+        </w:tc>
+      </w:tr>
+      <w:tr>
+        <w:tc>
+          <w:tcPr>
+            <w:tcW w:type="dxa" w:w="4320"/>
+          </w:tcPr>
+          <w:p>
+            <w:r>
+              <w:t>Masking</w:t>
+            </w:r>
+          </w:p>
+        </w:tc>
+        <w:tc>
+          <w:tcPr>
+            <w:tcW w:type="dxa" w:w="4320"/>
+          </w:tcPr>
+          <w:p>
+            <w:r>
+              <w:t>DOUBLE</w:t>
+            </w:r>
+          </w:p>
+        </w:tc>
+      </w:tr>
+      <w:tr>
+        <w:tc>
+          <w:tcPr>
+            <w:tcW w:type="dxa" w:w="4320"/>
+          </w:tcPr>
+          <w:p>
+            <w:r>
+              <w:t>Who Masked</w:t>
+            </w:r>
+          </w:p>
+        </w:tc>
+        <w:tc>
+          <w:tcPr>
+            <w:tcW w:type="dxa" w:w="4320"/>
+          </w:tcPr>
+          <w:p>
+            <w:r>
+              <w:t>['PARTICIPANT']</w:t>
             </w:r>
           </w:p>
         </w:tc>
@@ -295,7 +515,7 @@
           </w:tcPr>
           <w:p>
             <w:r>
-              <w:t>Date of AE Assessment</w:t>
+              <w:t>Adverse Event Assessment Date</w:t>
             </w:r>
           </w:p>
         </w:tc>
@@ -343,7 +563,7 @@
           </w:tcPr>
           <w:p>
             <w:r>
-              <w:t>Date of AE Collection</w:t>
+              <w:t>Date of Adverse Event Collection</w:t>
             </w:r>
           </w:p>
         </w:tc>
@@ -391,7 +611,7 @@
           </w:tcPr>
           <w:p>
             <w:r>
-              <w:t>Were any adverse events experienced</w:t>
+              <w:t>Were any adverse events experienced?</w:t>
             </w:r>
           </w:p>
         </w:tc>
@@ -1194,6 +1414,150 @@
           </w:p>
         </w:tc>
       </w:tr>
+      <w:tr>
+        <w:tc>
+          <w:tcPr>
+            <w:tcW w:type="dxa" w:w="1728"/>
+          </w:tcPr>
+          <w:p>
+            <w:r>
+              <w:t>AE_AETERM</w:t>
+            </w:r>
+          </w:p>
+        </w:tc>
+        <w:tc>
+          <w:tcPr>
+            <w:tcW w:type="dxa" w:w="1728"/>
+          </w:tcPr>
+          <w:p>
+            <w:r>
+              <w:t>What is the adverse event term?</w:t>
+            </w:r>
+          </w:p>
+        </w:tc>
+        <w:tc>
+          <w:tcPr>
+            <w:tcW w:type="dxa" w:w="1728"/>
+          </w:tcPr>
+          <w:p>
+            <w:r>
+              <w:t>Char</w:t>
+            </w:r>
+          </w:p>
+        </w:tc>
+        <w:tc>
+          <w:tcPr>
+            <w:tcW w:type="dxa" w:w="1728"/>
+          </w:tcPr>
+          <w:p>
+            <w:r>
+              <w:t>text</w:t>
+            </w:r>
+          </w:p>
+        </w:tc>
+        <w:tc>
+          <w:tcPr>
+            <w:tcW w:type="dxa" w:w="1728"/>
+          </w:tcPr>
+          <w:p/>
+        </w:tc>
+      </w:tr>
+      <w:tr>
+        <w:tc>
+          <w:tcPr>
+            <w:tcW w:type="dxa" w:w="1728"/>
+          </w:tcPr>
+          <w:p>
+            <w:r>
+              <w:t>AE_AESTDAT</w:t>
+            </w:r>
+          </w:p>
+        </w:tc>
+        <w:tc>
+          <w:tcPr>
+            <w:tcW w:type="dxa" w:w="1728"/>
+          </w:tcPr>
+          <w:p>
+            <w:r>
+              <w:t>Start Date</w:t>
+            </w:r>
+          </w:p>
+        </w:tc>
+        <w:tc>
+          <w:tcPr>
+            <w:tcW w:type="dxa" w:w="1728"/>
+          </w:tcPr>
+          <w:p>
+            <w:r>
+              <w:t>Char</w:t>
+            </w:r>
+          </w:p>
+        </w:tc>
+        <w:tc>
+          <w:tcPr>
+            <w:tcW w:type="dxa" w:w="1728"/>
+          </w:tcPr>
+          <w:p>
+            <w:r>
+              <w:t>text</w:t>
+            </w:r>
+          </w:p>
+        </w:tc>
+        <w:tc>
+          <w:tcPr>
+            <w:tcW w:type="dxa" w:w="1728"/>
+          </w:tcPr>
+          <w:p/>
+        </w:tc>
+      </w:tr>
+      <w:tr>
+        <w:tc>
+          <w:tcPr>
+            <w:tcW w:type="dxa" w:w="1728"/>
+          </w:tcPr>
+          <w:p>
+            <w:r>
+              <w:t>AE_AEENDAT</w:t>
+            </w:r>
+          </w:p>
+        </w:tc>
+        <w:tc>
+          <w:tcPr>
+            <w:tcW w:type="dxa" w:w="1728"/>
+          </w:tcPr>
+          <w:p>
+            <w:r>
+              <w:t>End Date</w:t>
+            </w:r>
+          </w:p>
+        </w:tc>
+        <w:tc>
+          <w:tcPr>
+            <w:tcW w:type="dxa" w:w="1728"/>
+          </w:tcPr>
+          <w:p>
+            <w:r>
+              <w:t>Char</w:t>
+            </w:r>
+          </w:p>
+        </w:tc>
+        <w:tc>
+          <w:tcPr>
+            <w:tcW w:type="dxa" w:w="1728"/>
+          </w:tcPr>
+          <w:p>
+            <w:r>
+              <w:t>text</w:t>
+            </w:r>
+          </w:p>
+        </w:tc>
+        <w:tc>
+          <w:tcPr>
+            <w:tcW w:type="dxa" w:w="1728"/>
+          </w:tcPr>
+          <w:p/>
+        </w:tc>
+      </w:tr>
     </w:tbl>
     <w:p>
       <w:r>

</xml_diff>